<commit_message>
Add photo and purchase link - Stitch
</commit_message>
<xml_diff>
--- a/Toy_Instructions/Sound_Movement_Light/Kids_Preferred_Laughing_and_Spinning_Stitch/Kids_Preferred_Laughing_and_Spinning_Stitch_Maker_Guide.docx
+++ b/Toy_Instructions/Sound_Movement_Light/Kids_Preferred_Laughing_and_Spinning_Stitch/Kids_Preferred_Laughing_and_Spinning_Stitch_Maker_Guide.docx
@@ -48,7 +48,7 @@
                 <w:noProof/>
               </w:rPr>
               <w:drawing>
-                <wp:anchor distT="0" distB="0" distL="114300" distR="114300" simplePos="0" relativeHeight="251658248" behindDoc="1" locked="0" layoutInCell="1" allowOverlap="1" wp14:anchorId="401718B6" wp14:editId="7F5E189D">
+                <wp:anchor distT="0" distB="0" distL="114300" distR="114300" simplePos="0" relativeHeight="251658248" behindDoc="1" locked="0" layoutInCell="1" allowOverlap="1" wp14:anchorId="401718B6" wp14:editId="644AC87B">
                   <wp:simplePos x="0" y="0"/>
                   <wp:positionH relativeFrom="column">
                     <wp:posOffset>50938</wp:posOffset>
@@ -59,7 +59,7 @@
                   <wp:extent cx="1391384" cy="1244813"/>
                   <wp:effectExtent l="0" t="0" r="0" b="0"/>
                   <wp:wrapNone/>
-                  <wp:docPr id="1877115323" name="Picture 1"/>
+                  <wp:docPr id="1877115323" name="Picture 1" descr="Plush toy Stitch character sitting down with hands between legs. Blue body with big eyes, big nose and tall pink ears. "/>
                   <wp:cNvGraphicFramePr>
                     <a:graphicFrameLocks xmlns:a="http://schemas.openxmlformats.org/drawingml/2006/main" noChangeAspect="1"/>
                   </wp:cNvGraphicFramePr>
@@ -67,7 +67,7 @@
                     <a:graphicData uri="http://schemas.openxmlformats.org/drawingml/2006/picture">
                       <pic:pic xmlns:pic="http://schemas.openxmlformats.org/drawingml/2006/picture">
                         <pic:nvPicPr>
-                          <pic:cNvPr id="1877115323" name=""/>
+                          <pic:cNvPr id="1877115323" name="Picture 1" descr="Plush toy Stitch character sitting down with hands between legs. Blue body with big eyes, big nose and tall pink ears. "/>
                           <pic:cNvPicPr/>
                         </pic:nvPicPr>
                         <pic:blipFill>
@@ -134,7 +134,7 @@
                 <w:szCs w:val="28"/>
               </w:rPr>
               <w:drawing>
-                <wp:anchor distT="0" distB="0" distL="114300" distR="114300" simplePos="0" relativeHeight="251658249" behindDoc="0" locked="0" layoutInCell="1" allowOverlap="1" wp14:anchorId="77044998" wp14:editId="10F3AF4B">
+                <wp:anchor distT="0" distB="0" distL="114300" distR="114300" simplePos="0" relativeHeight="251658249" behindDoc="0" locked="0" layoutInCell="1" allowOverlap="1" wp14:anchorId="77044998" wp14:editId="41A3C174">
                   <wp:simplePos x="0" y="0"/>
                   <wp:positionH relativeFrom="column">
                     <wp:posOffset>651697</wp:posOffset>
@@ -145,7 +145,7 @@
                   <wp:extent cx="552450" cy="1959610"/>
                   <wp:effectExtent l="0" t="0" r="0" b="2540"/>
                   <wp:wrapSquare wrapText="bothSides"/>
-                  <wp:docPr id="485151400" name="Picture 1" descr="A black pole with a white background&#10;&#10;AI-generated content may be incorrect."/>
+                  <wp:docPr id="485151400" name="Picture 1" descr="Closeup of a black mono cable. "/>
                   <wp:cNvGraphicFramePr>
                     <a:graphicFrameLocks xmlns:a="http://schemas.openxmlformats.org/drawingml/2006/main" noChangeAspect="1"/>
                   </wp:cNvGraphicFramePr>
@@ -153,7 +153,7 @@
                     <a:graphicData uri="http://schemas.openxmlformats.org/drawingml/2006/picture">
                       <pic:pic xmlns:pic="http://schemas.openxmlformats.org/drawingml/2006/picture">
                         <pic:nvPicPr>
-                          <pic:cNvPr id="485151400" name="Picture 1" descr="A black pole with a white background&#10;&#10;AI-generated content may be incorrect."/>
+                          <pic:cNvPr id="485151400" name="Picture 1" descr="Closeup of a black mono cable. "/>
                           <pic:cNvPicPr/>
                         </pic:nvPicPr>
                         <pic:blipFill>
@@ -221,6 +221,20 @@
             <w:r>
               <w:t>Kids preferred - Laughing and Spinning Stitch Plush Toy</w:t>
             </w:r>
+            <w:r>
+              <w:t xml:space="preserve"> (</w:t>
+            </w:r>
+            <w:hyperlink r:id="rId13" w:history="1">
+              <w:r>
+                <w:rPr>
+                  <w:rStyle w:val="Hyperlink"/>
+                </w:rPr>
+                <w:t>Walmart</w:t>
+              </w:r>
+            </w:hyperlink>
+            <w:r>
+              <w:t>)</w:t>
+            </w:r>
           </w:p>
           <w:p>
             <w:pPr>
@@ -263,7 +277,7 @@
             <w:r>
               <w:t xml:space="preserve">Refer to the </w:t>
             </w:r>
-            <w:hyperlink r:id="rId13" w:history="1">
+            <w:hyperlink r:id="rId14" w:history="1">
               <w:r>
                 <w:rPr>
                   <w:rStyle w:val="Hyperlink"/>
@@ -301,7 +315,7 @@
                 <w:noProof/>
               </w:rPr>
               <w:drawing>
-                <wp:anchor distT="0" distB="0" distL="114300" distR="114300" simplePos="0" relativeHeight="251658250" behindDoc="0" locked="0" layoutInCell="1" allowOverlap="1" wp14:anchorId="05B5DA2A" wp14:editId="5437EAE6">
+                <wp:anchor distT="0" distB="0" distL="114300" distR="114300" simplePos="0" relativeHeight="251658250" behindDoc="0" locked="0" layoutInCell="1" allowOverlap="1" wp14:anchorId="05B5DA2A" wp14:editId="78D91480">
                   <wp:simplePos x="0" y="0"/>
                   <wp:positionH relativeFrom="column">
                     <wp:posOffset>-14605</wp:posOffset>
@@ -312,7 +326,7 @@
                   <wp:extent cx="1323975" cy="992505"/>
                   <wp:effectExtent l="0" t="0" r="9525" b="0"/>
                   <wp:wrapSquare wrapText="bothSides"/>
-                  <wp:docPr id="138689806" name="Picture 2" descr="A black cable tie with a black strap&#10;&#10;AI-generated content may be incorrect."/>
+                  <wp:docPr id="138689806" name="Picture 2" descr="A small black cable tie "/>
                   <wp:cNvGraphicFramePr>
                     <a:graphicFrameLocks xmlns:a="http://schemas.openxmlformats.org/drawingml/2006/main" noChangeAspect="1"/>
                   </wp:cNvGraphicFramePr>
@@ -320,11 +334,11 @@
                     <a:graphicData uri="http://schemas.openxmlformats.org/drawingml/2006/picture">
                       <pic:pic xmlns:pic="http://schemas.openxmlformats.org/drawingml/2006/picture">
                         <pic:nvPicPr>
-                          <pic:cNvPr id="138689806" name="Picture 2" descr="A black cable tie with a black strap&#10;&#10;AI-generated content may be incorrect."/>
+                          <pic:cNvPr id="138689806" name="Picture 2" descr="A small black cable tie "/>
                           <pic:cNvPicPr/>
                         </pic:nvPicPr>
                         <pic:blipFill>
-                          <a:blip r:embed="rId14" cstate="print">
+                          <a:blip r:embed="rId15" cstate="print">
                             <a:extLst>
                               <a:ext uri="{28A0092B-C50C-407E-A947-70E740481C1C}">
                                 <a14:useLocalDpi xmlns:a14="http://schemas.microsoft.com/office/drawing/2010/main" val="0"/>
@@ -378,7 +392,7 @@
                 <w:noProof/>
               </w:rPr>
               <w:drawing>
-                <wp:anchor distT="0" distB="0" distL="114300" distR="114300" simplePos="0" relativeHeight="251658251" behindDoc="0" locked="0" layoutInCell="1" allowOverlap="1" wp14:anchorId="3CCD92B6" wp14:editId="4D95C805">
+                <wp:anchor distT="0" distB="0" distL="114300" distR="114300" simplePos="0" relativeHeight="251658251" behindDoc="0" locked="0" layoutInCell="1" allowOverlap="1" wp14:anchorId="3CCD92B6" wp14:editId="682A994E">
                   <wp:simplePos x="0" y="0"/>
                   <wp:positionH relativeFrom="column">
                     <wp:posOffset>82924</wp:posOffset>
@@ -389,7 +403,7 @@
                   <wp:extent cx="1529080" cy="1485900"/>
                   <wp:effectExtent l="0" t="0" r="0" b="0"/>
                   <wp:wrapSquare wrapText="bothSides"/>
-                  <wp:docPr id="808019295" name="Picture 2" descr="A black cable tie with a black strap&#10;&#10;AI-generated content may be incorrect."/>
+                  <wp:docPr id="808019295" name="Picture 2" descr="A large black cable tie "/>
                   <wp:cNvGraphicFramePr>
                     <a:graphicFrameLocks xmlns:a="http://schemas.openxmlformats.org/drawingml/2006/main" noChangeAspect="1"/>
                   </wp:cNvGraphicFramePr>
@@ -397,11 +411,11 @@
                     <a:graphicData uri="http://schemas.openxmlformats.org/drawingml/2006/picture">
                       <pic:pic xmlns:pic="http://schemas.openxmlformats.org/drawingml/2006/picture">
                         <pic:nvPicPr>
-                          <pic:cNvPr id="138689806" name="Picture 2" descr="A black cable tie with a black strap&#10;&#10;AI-generated content may be incorrect."/>
+                          <pic:cNvPr id="808019295" name="Picture 2" descr="A large black cable tie "/>
                           <pic:cNvPicPr/>
                         </pic:nvPicPr>
                         <pic:blipFill rotWithShape="1">
-                          <a:blip r:embed="rId15" cstate="print">
+                          <a:blip r:embed="rId16" cstate="print">
                             <a:extLst>
                               <a:ext uri="{28A0092B-C50C-407E-A947-70E740481C1C}">
                                 <a14:useLocalDpi xmlns:a14="http://schemas.microsoft.com/office/drawing/2010/main" val="0"/>
@@ -833,7 +847,7 @@
                 <w:noProof/>
               </w:rPr>
               <w:drawing>
-                <wp:anchor distT="0" distB="0" distL="114300" distR="114300" simplePos="0" relativeHeight="251658241" behindDoc="0" locked="0" layoutInCell="1" allowOverlap="1" wp14:anchorId="5E1F6C4D" wp14:editId="53D4636D">
+                <wp:anchor distT="0" distB="0" distL="114300" distR="114300" simplePos="0" relativeHeight="251658241" behindDoc="0" locked="0" layoutInCell="1" allowOverlap="1" wp14:anchorId="5E1F6C4D" wp14:editId="1322673A">
                   <wp:simplePos x="0" y="0"/>
                   <wp:positionH relativeFrom="column">
                     <wp:posOffset>845820</wp:posOffset>
@@ -844,7 +858,7 @@
                   <wp:extent cx="1631950" cy="3467100"/>
                   <wp:effectExtent l="0" t="0" r="6350" b="0"/>
                   <wp:wrapTopAndBottom/>
-                  <wp:docPr id="1588508060" name="Picture 18" descr="A gloved hand holding a white glove&#10;&#10;Description automatically generated"/>
+                  <wp:docPr id="1588508060" name="Picture 18" descr="Closeup of the white plastic box from inside the toy. The box is covered in fabric, and there is a cable tie around the box to hold the fabric in place. "/>
                   <wp:cNvGraphicFramePr>
                     <a:graphicFrameLocks xmlns:a="http://schemas.openxmlformats.org/drawingml/2006/main" noChangeAspect="1"/>
                   </wp:cNvGraphicFramePr>
@@ -852,11 +866,11 @@
                     <a:graphicData uri="http://schemas.openxmlformats.org/drawingml/2006/picture">
                       <pic:pic xmlns:pic="http://schemas.openxmlformats.org/drawingml/2006/picture">
                         <pic:nvPicPr>
-                          <pic:cNvPr id="1588508060" name="Picture 18" descr="A gloved hand holding a white glove&#10;&#10;Description automatically generated"/>
+                          <pic:cNvPr id="1588508060" name="Picture 18" descr="Closeup of the white plastic box from inside the toy. The box is covered in fabric, and there is a cable tie around the box to hold the fabric in place. "/>
                           <pic:cNvPicPr/>
                         </pic:nvPicPr>
                         <pic:blipFill rotWithShape="1">
-                          <a:blip r:embed="rId16" cstate="print">
+                          <a:blip r:embed="rId17" cstate="print">
                             <a:extLst>
                               <a:ext uri="{28A0092B-C50C-407E-A947-70E740481C1C}">
                                 <a14:useLocalDpi xmlns:a14="http://schemas.microsoft.com/office/drawing/2010/main" val="0"/>
@@ -1042,10 +1056,10 @@
                 <w:noProof/>
               </w:rPr>
               <w:drawing>
-                <wp:inline distT="0" distB="0" distL="0" distR="0" wp14:anchorId="634D6CB7" wp14:editId="65C016BD">
+                <wp:inline distT="0" distB="0" distL="0" distR="0" wp14:anchorId="634D6CB7" wp14:editId="51FFB375">
                   <wp:extent cx="1943100" cy="2590800"/>
                   <wp:effectExtent l="0" t="0" r="0" b="0"/>
-                  <wp:docPr id="75045726" name="Picture 2" descr="A hand holding a white plastic bottle&#10;&#10;Description automatically generated"/>
+                  <wp:docPr id="75045726" name="Picture 2" descr="A hand holding a white plastic container. This is the internal compartment of the toy. &#10;"/>
                   <wp:cNvGraphicFramePr>
                     <a:graphicFrameLocks xmlns:a="http://schemas.openxmlformats.org/drawingml/2006/main" noChangeAspect="1"/>
                   </wp:cNvGraphicFramePr>
@@ -1053,11 +1067,11 @@
                     <a:graphicData uri="http://schemas.openxmlformats.org/drawingml/2006/picture">
                       <pic:pic xmlns:pic="http://schemas.openxmlformats.org/drawingml/2006/picture">
                         <pic:nvPicPr>
-                          <pic:cNvPr id="75045726" name="Picture 2" descr="A hand holding a white plastic bottle&#10;&#10;Description automatically generated"/>
+                          <pic:cNvPr id="75045726" name="Picture 2" descr="A hand holding a white plastic container. This is the internal compartment of the toy. &#10;"/>
                           <pic:cNvPicPr/>
                         </pic:nvPicPr>
                         <pic:blipFill>
-                          <a:blip r:embed="rId17" cstate="print">
+                          <a:blip r:embed="rId18" cstate="print">
                             <a:extLst>
                               <a:ext uri="{28A0092B-C50C-407E-A947-70E740481C1C}">
                                 <a14:useLocalDpi xmlns:a14="http://schemas.microsoft.com/office/drawing/2010/main" val="0"/>
@@ -1282,10 +1296,10 @@
                 <w:noProof/>
               </w:rPr>
               <w:drawing>
-                <wp:inline distT="0" distB="0" distL="0" distR="0" wp14:anchorId="17224C7C" wp14:editId="7C298054">
+                <wp:inline distT="0" distB="0" distL="0" distR="0" wp14:anchorId="17224C7C" wp14:editId="68C019FE">
                   <wp:extent cx="1930400" cy="2573867"/>
                   <wp:effectExtent l="0" t="0" r="0" b="0"/>
-                  <wp:docPr id="1262539918" name="Picture 5" descr="A close up of a device&#10;&#10;Description automatically generated"/>
+                  <wp:docPr id="1262539918" name="Picture 5" descr="A close up of a Green PCB inside the internal compartment. There are wires and electrical components attached. Under the PCB there is a hole in the plastic container with a cable coming through. The exposed end of the cable is on the inside ofthe plastic container. "/>
                   <wp:cNvGraphicFramePr>
                     <a:graphicFrameLocks xmlns:a="http://schemas.openxmlformats.org/drawingml/2006/main" noChangeAspect="1"/>
                   </wp:cNvGraphicFramePr>
@@ -1293,11 +1307,11 @@
                     <a:graphicData uri="http://schemas.openxmlformats.org/drawingml/2006/picture">
                       <pic:pic xmlns:pic="http://schemas.openxmlformats.org/drawingml/2006/picture">
                         <pic:nvPicPr>
-                          <pic:cNvPr id="1262539918" name="Picture 5" descr="A close up of a device&#10;&#10;Description automatically generated"/>
+                          <pic:cNvPr id="1262539918" name="Picture 5" descr="A close up of a Green PCB inside the internal compartment. There are wires and electrical components attached. Under the PCB there is a hole in the plastic container with a cable coming through. The exposed end of the cable is on the inside ofthe plastic container. "/>
                           <pic:cNvPicPr/>
                         </pic:nvPicPr>
                         <pic:blipFill>
-                          <a:blip r:embed="rId18" cstate="print">
+                          <a:blip r:embed="rId19" cstate="print">
                             <a:extLst>
                               <a:ext uri="{28A0092B-C50C-407E-A947-70E740481C1C}">
                                 <a14:useLocalDpi xmlns:a14="http://schemas.microsoft.com/office/drawing/2010/main" val="0"/>
@@ -1479,7 +1493,7 @@
                 <w:noProof/>
               </w:rPr>
               <w:drawing>
-                <wp:anchor distT="0" distB="0" distL="114300" distR="114300" simplePos="0" relativeHeight="251658240" behindDoc="1" locked="0" layoutInCell="1" allowOverlap="1" wp14:anchorId="4F39A8B4" wp14:editId="3EA9BA3A">
+                <wp:anchor distT="0" distB="0" distL="114300" distR="114300" simplePos="0" relativeHeight="251658240" behindDoc="1" locked="0" layoutInCell="1" allowOverlap="1" wp14:anchorId="4F39A8B4" wp14:editId="3E0772D9">
                   <wp:simplePos x="0" y="0"/>
                   <wp:positionH relativeFrom="column">
                     <wp:posOffset>509270</wp:posOffset>
@@ -1490,7 +1504,7 @@
                   <wp:extent cx="2292350" cy="1874569"/>
                   <wp:effectExtent l="133350" t="114300" r="127000" b="163830"/>
                   <wp:wrapNone/>
-                  <wp:docPr id="1656168231" name="Picture 1656168231"/>
+                  <wp:docPr id="1656168231" name="Picture 1656168231" descr="Closeup of a black wire with the end exposed and coated in solder. "/>
                   <wp:cNvGraphicFramePr>
                     <a:graphicFrameLocks xmlns:a="http://schemas.openxmlformats.org/drawingml/2006/main" noChangeAspect="1"/>
                   </wp:cNvGraphicFramePr>
@@ -1498,11 +1512,11 @@
                     <a:graphicData uri="http://schemas.openxmlformats.org/drawingml/2006/picture">
                       <pic:pic xmlns:pic="http://schemas.openxmlformats.org/drawingml/2006/picture">
                         <pic:nvPicPr>
-                          <pic:cNvPr id="0" name=""/>
+                          <pic:cNvPr id="1656168231" name="Picture 1656168231" descr="Closeup of a black wire with the end exposed and coated in solder. "/>
                           <pic:cNvPicPr/>
                         </pic:nvPicPr>
                         <pic:blipFill>
-                          <a:blip r:embed="rId19" cstate="print">
+                          <a:blip r:embed="rId20" cstate="print">
                             <a:extLst>
                               <a:ext uri="{28A0092B-C50C-407E-A947-70E740481C1C}">
                                 <a14:useLocalDpi xmlns:a14="http://schemas.microsoft.com/office/drawing/2010/main" val="0"/>
@@ -1589,7 +1603,7 @@
                 <w:sz w:val="24"/>
                 <w:szCs w:val="24"/>
               </w:rPr>
-              <w:t xml:space="preserve">One the circuit board, </w:t>
+              <w:t xml:space="preserve">On the circuit board, </w:t>
             </w:r>
             <w:r>
               <w:rPr>
@@ -1812,10 +1826,10 @@
                 <w:noProof/>
               </w:rPr>
               <w:drawing>
-                <wp:inline distT="0" distB="0" distL="0" distR="0" wp14:anchorId="4682B3C7" wp14:editId="790130CD">
+                <wp:inline distT="0" distB="0" distL="0" distR="0" wp14:anchorId="4682B3C7" wp14:editId="7DC5CF16">
                   <wp:extent cx="3196590" cy="2397760"/>
                   <wp:effectExtent l="0" t="0" r="3810" b="2540"/>
-                  <wp:docPr id="609006654" name="Picture 4" descr="A small circuit board with wires&#10;&#10;Description automatically generated"/>
+                  <wp:docPr id="609006654" name="Picture 4" descr="Closeup of a green PCB with wires and electrical component. Two wires soldered to the board in the bottom right corner are circled in red. "/>
                   <wp:cNvGraphicFramePr>
                     <a:graphicFrameLocks xmlns:a="http://schemas.openxmlformats.org/drawingml/2006/main" noChangeAspect="1"/>
                   </wp:cNvGraphicFramePr>
@@ -1823,11 +1837,11 @@
                     <a:graphicData uri="http://schemas.openxmlformats.org/drawingml/2006/picture">
                       <pic:pic xmlns:pic="http://schemas.openxmlformats.org/drawingml/2006/picture">
                         <pic:nvPicPr>
-                          <pic:cNvPr id="609006654" name="Picture 4" descr="A small circuit board with wires&#10;&#10;Description automatically generated"/>
+                          <pic:cNvPr id="609006654" name="Picture 4" descr="Closeup of a green PCB with wires and electrical component. Two wires soldered to the board in the bottom right corner are circled in red. "/>
                           <pic:cNvPicPr/>
                         </pic:nvPicPr>
                         <pic:blipFill>
-                          <a:blip r:embed="rId20" cstate="print">
+                          <a:blip r:embed="rId21" cstate="print">
                             <a:extLst>
                               <a:ext uri="{28A0092B-C50C-407E-A947-70E740481C1C}">
                                 <a14:useLocalDpi xmlns:a14="http://schemas.microsoft.com/office/drawing/2010/main" val="0"/>
@@ -2178,10 +2192,10 @@
                 <w:noProof/>
               </w:rPr>
               <w:drawing>
-                <wp:inline distT="0" distB="0" distL="0" distR="0" wp14:anchorId="594F7E24" wp14:editId="35C6D716">
+                <wp:inline distT="0" distB="0" distL="0" distR="0" wp14:anchorId="594F7E24" wp14:editId="2D0074DD">
                   <wp:extent cx="4297055" cy="2603500"/>
                   <wp:effectExtent l="0" t="0" r="8255" b="6350"/>
-                  <wp:docPr id="1152644486" name="Picture 6" descr="A close up of a circuit board&#10;&#10;Description automatically generated"/>
+                  <wp:docPr id="1152644486" name="Picture 6" descr="Closeup of a green PCB with wires and electrical component. The two wires in the bottom right corner now have one extra wire soldered to their connections. There is a red arrow pointing to these connections."/>
                   <wp:cNvGraphicFramePr>
                     <a:graphicFrameLocks xmlns:a="http://schemas.openxmlformats.org/drawingml/2006/main" noChangeAspect="1"/>
                   </wp:cNvGraphicFramePr>
@@ -2189,11 +2203,11 @@
                     <a:graphicData uri="http://schemas.openxmlformats.org/drawingml/2006/picture">
                       <pic:pic xmlns:pic="http://schemas.openxmlformats.org/drawingml/2006/picture">
                         <pic:nvPicPr>
-                          <pic:cNvPr id="1152644486" name="Picture 6" descr="A close up of a circuit board&#10;&#10;Description automatically generated"/>
+                          <pic:cNvPr id="1152644486" name="Picture 6" descr="Closeup of a green PCB with wires and electrical component. The two wires in the bottom right corner now have one extra wire soldered to their connections. There is a red arrow pointing to these connections."/>
                           <pic:cNvPicPr/>
                         </pic:nvPicPr>
                         <pic:blipFill rotWithShape="1">
-                          <a:blip r:embed="rId21" cstate="print">
+                          <a:blip r:embed="rId22" cstate="print">
                             <a:extLst>
                               <a:ext uri="{28A0092B-C50C-407E-A947-70E740481C1C}">
                                 <a14:useLocalDpi xmlns:a14="http://schemas.microsoft.com/office/drawing/2010/main" val="0"/>
@@ -2256,7 +2270,21 @@
                 <w:sz w:val="24"/>
                 <w:szCs w:val="24"/>
               </w:rPr>
-              <w:t xml:space="preserve">If both new wires are connected to their spots, along with the original white wires, you can not test the toy. </w:t>
+              <w:t>If both new wires are connected to their spots, along with the original white wires, you can no</w:t>
+            </w:r>
+            <w:r>
+              <w:rPr>
+                <w:sz w:val="24"/>
+                <w:szCs w:val="24"/>
+              </w:rPr>
+              <w:t>w</w:t>
+            </w:r>
+            <w:r>
+              <w:rPr>
+                <w:sz w:val="24"/>
+                <w:szCs w:val="24"/>
+              </w:rPr>
+              <w:t xml:space="preserve"> test the toy. </w:t>
             </w:r>
           </w:p>
           <w:p>
@@ -2348,10 +2376,10 @@
                 <w:noProof/>
               </w:rPr>
               <w:drawing>
-                <wp:inline distT="0" distB="0" distL="0" distR="0" wp14:anchorId="23012A53" wp14:editId="4E2BF3C3">
+                <wp:inline distT="0" distB="0" distL="0" distR="0" wp14:anchorId="23012A53" wp14:editId="7A6E6AF4">
                   <wp:extent cx="3196590" cy="2397760"/>
                   <wp:effectExtent l="0" t="0" r="3810" b="2540"/>
-                  <wp:docPr id="2101492530" name="Picture 7" descr="A close up of a circuit board&#10;&#10;Description automatically generated"/>
+                  <wp:docPr id="2101492530" name="Picture 7" descr="A close up of the green PCB. Same as previous photo."/>
                   <wp:cNvGraphicFramePr>
                     <a:graphicFrameLocks xmlns:a="http://schemas.openxmlformats.org/drawingml/2006/main" noChangeAspect="1"/>
                   </wp:cNvGraphicFramePr>
@@ -2359,11 +2387,11 @@
                     <a:graphicData uri="http://schemas.openxmlformats.org/drawingml/2006/picture">
                       <pic:pic xmlns:pic="http://schemas.openxmlformats.org/drawingml/2006/picture">
                         <pic:nvPicPr>
-                          <pic:cNvPr id="2101492530" name="Picture 7" descr="A close up of a circuit board&#10;&#10;Description automatically generated"/>
+                          <pic:cNvPr id="2101492530" name="Picture 7" descr="A close up of the green PCB. Same as previous photo."/>
                           <pic:cNvPicPr/>
                         </pic:nvPicPr>
                         <pic:blipFill>
-                          <a:blip r:embed="rId22" cstate="print">
+                          <a:blip r:embed="rId23" cstate="print">
                             <a:extLst>
                               <a:ext uri="{28A0092B-C50C-407E-A947-70E740481C1C}">
                                 <a14:useLocalDpi xmlns:a14="http://schemas.microsoft.com/office/drawing/2010/main" val="0"/>
@@ -2396,7 +2424,7 @@
         <w:trPr>
           <w:gridAfter w:val="1"/>
           <w:wAfter w:w="28" w:type="dxa"/>
-          <w:trHeight w:val="4806"/>
+          <w:trHeight w:val="4239"/>
         </w:trPr>
         <w:tc>
           <w:tcPr>
@@ -2572,20 +2600,15 @@
             <w:pPr>
               <w:jc w:val="center"/>
             </w:pPr>
-          </w:p>
-          <w:p>
-            <w:pPr>
-              <w:jc w:val="center"/>
-            </w:pPr>
             <w:r>
               <w:rPr>
                 <w:noProof/>
               </w:rPr>
               <w:drawing>
-                <wp:inline distT="0" distB="0" distL="0" distR="0" wp14:anchorId="1444ED80" wp14:editId="26AC6526">
+                <wp:inline distT="0" distB="0" distL="0" distR="0" wp14:anchorId="1444ED80" wp14:editId="4B543076">
                   <wp:extent cx="1974850" cy="2633133"/>
                   <wp:effectExtent l="0" t="0" r="6350" b="0"/>
-                  <wp:docPr id="1939211584" name="Picture 8" descr="A close-up of a device&#10;&#10;Description automatically generated"/>
+                  <wp:docPr id="1939211584" name="Picture 8" descr="Close-up of a cable tie fastened around the mono cable at the location of the hole in the plastic. "/>
                   <wp:cNvGraphicFramePr>
                     <a:graphicFrameLocks xmlns:a="http://schemas.openxmlformats.org/drawingml/2006/main" noChangeAspect="1"/>
                   </wp:cNvGraphicFramePr>
@@ -2593,11 +2616,11 @@
                     <a:graphicData uri="http://schemas.openxmlformats.org/drawingml/2006/picture">
                       <pic:pic xmlns:pic="http://schemas.openxmlformats.org/drawingml/2006/picture">
                         <pic:nvPicPr>
-                          <pic:cNvPr id="1939211584" name="Picture 8" descr="A close-up of a device&#10;&#10;Description automatically generated"/>
+                          <pic:cNvPr id="1939211584" name="Picture 8" descr="Close-up of a cable tie fastened around the mono cable at the location of the hole in the plastic. "/>
                           <pic:cNvPicPr/>
                         </pic:nvPicPr>
                         <pic:blipFill>
-                          <a:blip r:embed="rId23" cstate="print">
+                          <a:blip r:embed="rId24" cstate="print">
                             <a:extLst>
                               <a:ext uri="{28A0092B-C50C-407E-A947-70E740481C1C}">
                                 <a14:useLocalDpi xmlns:a14="http://schemas.microsoft.com/office/drawing/2010/main" val="0"/>
@@ -2838,20 +2861,15 @@
             <w:pPr>
               <w:jc w:val="center"/>
             </w:pPr>
-          </w:p>
-          <w:p>
-            <w:pPr>
-              <w:jc w:val="center"/>
-            </w:pPr>
             <w:r>
               <w:rPr>
                 <w:noProof/>
               </w:rPr>
               <w:drawing>
-                <wp:inline distT="0" distB="0" distL="0" distR="0" wp14:anchorId="73874347" wp14:editId="33B2C96C">
+                <wp:inline distT="0" distB="0" distL="0" distR="0" wp14:anchorId="73874347" wp14:editId="32779B34">
                   <wp:extent cx="1993900" cy="2658533"/>
                   <wp:effectExtent l="0" t="0" r="6350" b="8890"/>
-                  <wp:docPr id="1837242221" name="Picture 9" descr="A blue stuffed animal with a black headphone&#10;&#10;Description automatically generated"/>
+                  <wp:docPr id="1837242221" name="Picture 9" descr="Bottom view of a blue stuffed animal with a black cable coming out of the bottom. "/>
                   <wp:cNvGraphicFramePr>
                     <a:graphicFrameLocks xmlns:a="http://schemas.openxmlformats.org/drawingml/2006/main" noChangeAspect="1"/>
                   </wp:cNvGraphicFramePr>
@@ -2859,11 +2877,11 @@
                     <a:graphicData uri="http://schemas.openxmlformats.org/drawingml/2006/picture">
                       <pic:pic xmlns:pic="http://schemas.openxmlformats.org/drawingml/2006/picture">
                         <pic:nvPicPr>
-                          <pic:cNvPr id="1837242221" name="Picture 9" descr="A blue stuffed animal with a black headphone&#10;&#10;Description automatically generated"/>
+                          <pic:cNvPr id="1837242221" name="Picture 9" descr="Bottom view of a blue stuffed animal with a black cable coming out of the bottom. "/>
                           <pic:cNvPicPr/>
                         </pic:nvPicPr>
                         <pic:blipFill>
-                          <a:blip r:embed="rId24" cstate="print">
+                          <a:blip r:embed="rId25" cstate="print">
                             <a:extLst>
                               <a:ext uri="{28A0092B-C50C-407E-A947-70E740481C1C}">
                                 <a14:useLocalDpi xmlns:a14="http://schemas.microsoft.com/office/drawing/2010/main" val="0"/>
@@ -2890,11 +2908,6 @@
               </w:drawing>
             </w:r>
           </w:p>
-          <w:p>
-            <w:pPr>
-              <w:jc w:val="center"/>
-            </w:pPr>
-          </w:p>
         </w:tc>
       </w:tr>
       <w:tr>
@@ -2902,7 +2915,7 @@
           <w:tblLook w:val="04A0" w:firstRow="1" w:lastRow="0" w:firstColumn="1" w:lastColumn="0" w:noHBand="0" w:noVBand="1"/>
         </w:tblPrEx>
         <w:trPr>
-          <w:trHeight w:val="3283"/>
+          <w:trHeight w:val="2431"/>
         </w:trPr>
         <w:tc>
           <w:tcPr>
@@ -2927,18 +2940,18 @@
           <w:p>
             <w:pPr>
               <w:pStyle w:val="ListParagraph"/>
+              <w:numPr>
+                <w:ilvl w:val="0"/>
+                <w:numId w:val="3"/>
+              </w:numPr>
             </w:pPr>
             <w:r>
-              <w:t xml:space="preserve"> </w:t>
-            </w:r>
-            <w:r>
-              <w:t>Your toy is now complete!</w:t>
-            </w:r>
-          </w:p>
-          <w:p>
-            <w:pPr>
-              <w:pStyle w:val="ListParagraph"/>
-            </w:pPr>
+              <w:rPr>
+                <w:sz w:val="24"/>
+                <w:szCs w:val="24"/>
+              </w:rPr>
+              <w:t>Repackage the toy. The toy is now complete!</w:t>
+            </w:r>
           </w:p>
         </w:tc>
         <w:tc>
@@ -2947,23 +2960,18 @@
             <w:gridSpan w:val="2"/>
           </w:tcPr>
           <w:p>
+            <w:pPr>
+              <w:jc w:val="center"/>
+            </w:pPr>
             <w:r>
               <w:rPr>
                 <w:noProof/>
               </w:rPr>
               <w:drawing>
-                <wp:anchor distT="0" distB="0" distL="114300" distR="114300" simplePos="0" relativeHeight="251658247" behindDoc="1" locked="0" layoutInCell="1" allowOverlap="1" wp14:anchorId="638F9029" wp14:editId="51F0FD6B">
-                  <wp:simplePos x="0" y="0"/>
-                  <wp:positionH relativeFrom="column">
-                    <wp:posOffset>742315</wp:posOffset>
-                  </wp:positionH>
-                  <wp:positionV relativeFrom="paragraph">
-                    <wp:posOffset>220345</wp:posOffset>
-                  </wp:positionV>
-                  <wp:extent cx="1828800" cy="1636151"/>
-                  <wp:effectExtent l="0" t="0" r="0" b="2540"/>
-                  <wp:wrapNone/>
-                  <wp:docPr id="918413450" name="Picture 1"/>
+                <wp:inline distT="0" distB="0" distL="0" distR="0" wp14:anchorId="7F643B7C" wp14:editId="665C9975">
+                  <wp:extent cx="2139043" cy="2139043"/>
+                  <wp:effectExtent l="0" t="0" r="0" b="0"/>
+                  <wp:docPr id="1310816030" name="Picture 6"/>
                   <wp:cNvGraphicFramePr>
                     <a:graphicFrameLocks xmlns:a="http://schemas.openxmlformats.org/drawingml/2006/main" noChangeAspect="1"/>
                   </wp:cNvGraphicFramePr>
@@ -2971,40 +2979,41 @@
                     <a:graphicData uri="http://schemas.openxmlformats.org/drawingml/2006/picture">
                       <pic:pic xmlns:pic="http://schemas.openxmlformats.org/drawingml/2006/picture">
                         <pic:nvPicPr>
-                          <pic:cNvPr id="1877115323" name=""/>
-                          <pic:cNvPicPr/>
+                          <pic:cNvPr id="0" name="Picture 1"/>
+                          <pic:cNvPicPr>
+                            <a:picLocks noChangeAspect="1" noChangeArrowheads="1"/>
+                          </pic:cNvPicPr>
                         </pic:nvPicPr>
                         <pic:blipFill>
-                          <a:blip r:embed="rId11" cstate="print">
+                          <a:blip r:embed="rId26">
                             <a:extLst>
                               <a:ext uri="{28A0092B-C50C-407E-A947-70E740481C1C}">
                                 <a14:useLocalDpi xmlns:a14="http://schemas.microsoft.com/office/drawing/2010/main" val="0"/>
                               </a:ext>
                             </a:extLst>
                           </a:blip>
+                          <a:srcRect/>
                           <a:stretch>
                             <a:fillRect/>
                           </a:stretch>
                         </pic:blipFill>
-                        <pic:spPr>
+                        <pic:spPr bwMode="auto">
                           <a:xfrm>
                             <a:off x="0" y="0"/>
-                            <a:ext cx="1828800" cy="1636151"/>
+                            <a:ext cx="2143534" cy="2143534"/>
                           </a:xfrm>
                           <a:prstGeom prst="rect">
                             <a:avLst/>
                           </a:prstGeom>
+                          <a:noFill/>
+                          <a:ln>
+                            <a:noFill/>
+                          </a:ln>
                         </pic:spPr>
                       </pic:pic>
                     </a:graphicData>
                   </a:graphic>
-                  <wp14:sizeRelH relativeFrom="margin">
-                    <wp14:pctWidth>0</wp14:pctWidth>
-                  </wp14:sizeRelH>
-                  <wp14:sizeRelV relativeFrom="margin">
-                    <wp14:pctHeight>0</wp14:pctHeight>
-                  </wp14:sizeRelV>
-                </wp:anchor>
+                </wp:inline>
               </w:drawing>
             </w:r>
           </w:p>
@@ -3020,8 +3029,8 @@
       </w:pPr>
     </w:p>
     <w:sectPr>
-      <w:headerReference w:type="default" r:id="rId25"/>
-      <w:footerReference w:type="default" r:id="rId26"/>
+      <w:headerReference w:type="default" r:id="rId27"/>
+      <w:footerReference w:type="default" r:id="rId28"/>
       <w:pgSz w:w="12240" w:h="15840"/>
       <w:pgMar w:top="1440" w:right="1440" w:bottom="1440" w:left="1440" w:header="720" w:footer="708" w:gutter="0"/>
       <w:cols w:space="708"/>
@@ -3442,6 +3451,17 @@
         <w:sz w:val="16"/>
         <w:szCs w:val="16"/>
       </w:rPr>
+      <w:t>.1</w:t>
+    </w:r>
+    <w:r>
+      <w:rPr>
+        <w:rFonts w:ascii="Calibri" w:eastAsia="Calibri" w:hAnsi="Calibri" w:cs="Calibri"/>
+        <w:b/>
+        <w:bCs/>
+        <w:color w:val="646464"/>
+        <w:sz w:val="16"/>
+        <w:szCs w:val="16"/>
+      </w:rPr>
       <w:t xml:space="preserve"> | </w:t>
     </w:r>
     <w:r>
@@ -3535,29 +3555,7 @@
         <w:sz w:val="16"/>
         <w:szCs w:val="16"/>
       </w:rPr>
-      <w:t>November</w:t>
-    </w:r>
-    <w:r>
-      <w:rPr>
-        <w:rFonts w:ascii="Calibri" w:eastAsia="Calibri" w:hAnsi="Calibri" w:cs="Calibri"/>
-        <w:b/>
-        <w:bCs/>
-        <w:color w:val="646464"/>
-        <w:sz w:val="16"/>
-        <w:szCs w:val="16"/>
-      </w:rPr>
-      <w:t xml:space="preserve"> 202</w:t>
-    </w:r>
-    <w:r>
-      <w:rPr>
-        <w:rFonts w:ascii="Calibri" w:eastAsia="Calibri" w:hAnsi="Calibri" w:cs="Calibri"/>
-        <w:b/>
-        <w:bCs/>
-        <w:color w:val="646464"/>
-        <w:sz w:val="16"/>
-        <w:szCs w:val="16"/>
-      </w:rPr>
-      <w:t>4</w:t>
+      <w:t>August 2026</w:t>
     </w:r>
   </w:p>
   <w:p>
@@ -4902,7 +4900,7 @@
   <w:abstractNum w:abstractNumId="14" w15:restartNumberingAfterBreak="0">
     <w:nsid w:val="518A615E"/>
     <w:multiLevelType w:val="hybridMultilevel"/>
-    <w:tmpl w:val="92D4424E"/>
+    <w:tmpl w:val="3EAEFA82"/>
     <w:lvl w:ilvl="0" w:tplc="1009000F">
       <w:start w:val="1"/>
       <w:numFmt w:val="decimal"/>
@@ -4986,6 +4984,92 @@
     </w:lvl>
   </w:abstractNum>
   <w:abstractNum w:abstractNumId="15" w15:restartNumberingAfterBreak="0">
+    <w:nsid w:val="544065AD"/>
+    <w:multiLevelType w:val="hybridMultilevel"/>
+    <w:tmpl w:val="E5D85112"/>
+    <w:lvl w:ilvl="0" w:tplc="1009000F">
+      <w:start w:val="1"/>
+      <w:numFmt w:val="decimal"/>
+      <w:lvlText w:val="%1."/>
+      <w:lvlJc w:val="left"/>
+      <w:pPr>
+        <w:ind w:left="720" w:hanging="360"/>
+      </w:pPr>
+    </w:lvl>
+    <w:lvl w:ilvl="1" w:tplc="10090019" w:tentative="1">
+      <w:start w:val="1"/>
+      <w:numFmt w:val="lowerLetter"/>
+      <w:lvlText w:val="%2."/>
+      <w:lvlJc w:val="left"/>
+      <w:pPr>
+        <w:ind w:left="1440" w:hanging="360"/>
+      </w:pPr>
+    </w:lvl>
+    <w:lvl w:ilvl="2" w:tplc="1009001B" w:tentative="1">
+      <w:start w:val="1"/>
+      <w:numFmt w:val="lowerRoman"/>
+      <w:lvlText w:val="%3."/>
+      <w:lvlJc w:val="right"/>
+      <w:pPr>
+        <w:ind w:left="2160" w:hanging="180"/>
+      </w:pPr>
+    </w:lvl>
+    <w:lvl w:ilvl="3" w:tplc="1009000F" w:tentative="1">
+      <w:start w:val="1"/>
+      <w:numFmt w:val="decimal"/>
+      <w:lvlText w:val="%4."/>
+      <w:lvlJc w:val="left"/>
+      <w:pPr>
+        <w:ind w:left="2880" w:hanging="360"/>
+      </w:pPr>
+    </w:lvl>
+    <w:lvl w:ilvl="4" w:tplc="10090019" w:tentative="1">
+      <w:start w:val="1"/>
+      <w:numFmt w:val="lowerLetter"/>
+      <w:lvlText w:val="%5."/>
+      <w:lvlJc w:val="left"/>
+      <w:pPr>
+        <w:ind w:left="3600" w:hanging="360"/>
+      </w:pPr>
+    </w:lvl>
+    <w:lvl w:ilvl="5" w:tplc="1009001B" w:tentative="1">
+      <w:start w:val="1"/>
+      <w:numFmt w:val="lowerRoman"/>
+      <w:lvlText w:val="%6."/>
+      <w:lvlJc w:val="right"/>
+      <w:pPr>
+        <w:ind w:left="4320" w:hanging="180"/>
+      </w:pPr>
+    </w:lvl>
+    <w:lvl w:ilvl="6" w:tplc="1009000F" w:tentative="1">
+      <w:start w:val="1"/>
+      <w:numFmt w:val="decimal"/>
+      <w:lvlText w:val="%7."/>
+      <w:lvlJc w:val="left"/>
+      <w:pPr>
+        <w:ind w:left="5040" w:hanging="360"/>
+      </w:pPr>
+    </w:lvl>
+    <w:lvl w:ilvl="7" w:tplc="10090019" w:tentative="1">
+      <w:start w:val="1"/>
+      <w:numFmt w:val="lowerLetter"/>
+      <w:lvlText w:val="%8."/>
+      <w:lvlJc w:val="left"/>
+      <w:pPr>
+        <w:ind w:left="5760" w:hanging="360"/>
+      </w:pPr>
+    </w:lvl>
+    <w:lvl w:ilvl="8" w:tplc="1009001B" w:tentative="1">
+      <w:start w:val="1"/>
+      <w:numFmt w:val="lowerRoman"/>
+      <w:lvlText w:val="%9."/>
+      <w:lvlJc w:val="right"/>
+      <w:pPr>
+        <w:ind w:left="6480" w:hanging="180"/>
+      </w:pPr>
+    </w:lvl>
+  </w:abstractNum>
+  <w:abstractNum w:abstractNumId="16" w15:restartNumberingAfterBreak="0">
     <w:nsid w:val="54FC1966"/>
     <w:multiLevelType w:val="hybridMultilevel"/>
     <w:tmpl w:val="C6D8DF44"/>
@@ -5074,7 +5158,7 @@
       </w:pPr>
     </w:lvl>
   </w:abstractNum>
-  <w:abstractNum w:abstractNumId="16" w15:restartNumberingAfterBreak="0">
+  <w:abstractNum w:abstractNumId="17" w15:restartNumberingAfterBreak="0">
     <w:nsid w:val="61C92684"/>
     <w:multiLevelType w:val="hybridMultilevel"/>
     <w:tmpl w:val="F0AA404E"/>
@@ -5168,7 +5252,7 @@
       </w:pPr>
     </w:lvl>
   </w:abstractNum>
-  <w:abstractNum w:abstractNumId="17" w15:restartNumberingAfterBreak="0">
+  <w:abstractNum w:abstractNumId="18" w15:restartNumberingAfterBreak="0">
     <w:nsid w:val="64BFD1BD"/>
     <w:multiLevelType w:val="multilevel"/>
     <w:tmpl w:val="5E3A47F6"/>
@@ -5254,7 +5338,7 @@
       </w:pPr>
     </w:lvl>
   </w:abstractNum>
-  <w:abstractNum w:abstractNumId="18" w15:restartNumberingAfterBreak="0">
+  <w:abstractNum w:abstractNumId="19" w15:restartNumberingAfterBreak="0">
     <w:nsid w:val="68903CFA"/>
     <w:multiLevelType w:val="hybridMultilevel"/>
     <w:tmpl w:val="697C1250"/>
@@ -5367,7 +5451,7 @@
       </w:rPr>
     </w:lvl>
   </w:abstractNum>
-  <w:abstractNum w:abstractNumId="19" w15:restartNumberingAfterBreak="0">
+  <w:abstractNum w:abstractNumId="20" w15:restartNumberingAfterBreak="0">
     <w:nsid w:val="693036F5"/>
     <w:multiLevelType w:val="hybridMultilevel"/>
     <w:tmpl w:val="A2982966"/>
@@ -5479,7 +5563,7 @@
       </w:rPr>
     </w:lvl>
   </w:abstractNum>
-  <w:abstractNum w:abstractNumId="20" w15:restartNumberingAfterBreak="0">
+  <w:abstractNum w:abstractNumId="21" w15:restartNumberingAfterBreak="0">
     <w:nsid w:val="73C06668"/>
     <w:multiLevelType w:val="hybridMultilevel"/>
     <w:tmpl w:val="37C4D090"/>
@@ -5565,7 +5649,7 @@
       </w:pPr>
     </w:lvl>
   </w:abstractNum>
-  <w:abstractNum w:abstractNumId="21" w15:restartNumberingAfterBreak="0">
+  <w:abstractNum w:abstractNumId="22" w15:restartNumberingAfterBreak="0">
     <w:nsid w:val="7DBA1F20"/>
     <w:multiLevelType w:val="hybridMultilevel"/>
     <w:tmpl w:val="F3546EC6"/>
@@ -5656,7 +5740,7 @@
     </w:lvl>
   </w:abstractNum>
   <w:num w:numId="1" w16cid:durableId="1037586288">
-    <w:abstractNumId w:val="17"/>
+    <w:abstractNumId w:val="18"/>
   </w:num>
   <w:num w:numId="2" w16cid:durableId="803354008">
     <w:abstractNumId w:val="2"/>
@@ -5680,16 +5764,16 @@
     <w:abstractNumId w:val="5"/>
   </w:num>
   <w:num w:numId="9" w16cid:durableId="1237352173">
-    <w:abstractNumId w:val="19"/>
+    <w:abstractNumId w:val="20"/>
   </w:num>
   <w:num w:numId="10" w16cid:durableId="2112964828">
-    <w:abstractNumId w:val="18"/>
+    <w:abstractNumId w:val="19"/>
   </w:num>
   <w:num w:numId="11" w16cid:durableId="851795054">
     <w:abstractNumId w:val="11"/>
   </w:num>
   <w:num w:numId="12" w16cid:durableId="1587763859">
-    <w:abstractNumId w:val="20"/>
+    <w:abstractNumId w:val="21"/>
   </w:num>
   <w:num w:numId="13" w16cid:durableId="1628124965">
     <w:abstractNumId w:val="3"/>
@@ -5701,7 +5785,7 @@
     <w:abstractNumId w:val="9"/>
   </w:num>
   <w:num w:numId="16" w16cid:durableId="942491990">
-    <w:abstractNumId w:val="21"/>
+    <w:abstractNumId w:val="22"/>
   </w:num>
   <w:num w:numId="17" w16cid:durableId="2065132653">
     <w:abstractNumId w:val="10"/>
@@ -5716,9 +5800,12 @@
     <w:abstractNumId w:val="7"/>
   </w:num>
   <w:num w:numId="21" w16cid:durableId="1358388782">
+    <w:abstractNumId w:val="17"/>
+  </w:num>
+  <w:num w:numId="22" w16cid:durableId="1472284014">
     <w:abstractNumId w:val="16"/>
   </w:num>
-  <w:num w:numId="22" w16cid:durableId="1472284014">
+  <w:num w:numId="23" w16cid:durableId="127741920">
     <w:abstractNumId w:val="15"/>
   </w:num>
 </w:numbering>
@@ -6858,6 +6945,18 @@
       <w:szCs w:val="24"/>
     </w:rPr>
   </w:style>
+  <w:style w:type="character" w:styleId="UnresolvedMention">
+    <w:name w:val="Unresolved Mention"/>
+    <w:basedOn w:val="DefaultParagraphFont"/>
+    <w:uiPriority w:val="99"/>
+    <w:semiHidden/>
+    <w:unhideWhenUsed/>
+    <w:rsid w:val="0065616C"/>
+    <w:rPr>
+      <w:color w:val="605E5C"/>
+      <w:shd w:val="clear" w:color="auto" w:fill="E1DFDD"/>
+    </w:rPr>
+  </w:style>
 </w:styles>
 </file>
 
@@ -7123,30 +7222,6 @@
 </file>
 
 <file path=customXml/item1.xml><?xml version="1.0" encoding="utf-8"?>
-<p:properties xmlns:p="http://schemas.microsoft.com/office/2006/metadata/properties" xmlns:xsi="http://www.w3.org/2001/XMLSchema-instance" xmlns:pc="http://schemas.microsoft.com/office/infopath/2007/PartnerControls">
-  <documentManagement>
-    <TaxCatchAll xmlns="38b325e6-602c-452a-8617-173bf47082c5" xsi:nil="true"/>
-    <lcf76f155ced4ddcb4097134ff3c332f xmlns="8cf100d1-0775-4feb-8634-62999c4541bc">
-      <Terms xmlns="http://schemas.microsoft.com/office/infopath/2007/PartnerControls"/>
-    </lcf76f155ced4ddcb4097134ff3c332f>
-  </documentManagement>
-</p:properties>
-</file>
-
-<file path=customXml/item2.xml><?xml version="1.0" encoding="utf-8"?>
-<?mso-contentType ?>
-<FormTemplates xmlns="http://schemas.microsoft.com/sharepoint/v3/contenttype/forms">
-  <Display>DocumentLibraryForm</Display>
-  <Edit>DocumentLibraryForm</Edit>
-  <New>DocumentLibraryForm</New>
-</FormTemplates>
-</file>
-
-<file path=customXml/item3.xml><?xml version="1.0" encoding="utf-8"?>
-<b:Sources xmlns:b="http://schemas.openxmlformats.org/officeDocument/2006/bibliography" xmlns="http://schemas.openxmlformats.org/officeDocument/2006/bibliography" SelectedStyle="\APASixthEditionOfficeOnline.xsl" StyleName="APA" Version="6"/>
-</file>
-
-<file path=customXml/item4.xml><?xml version="1.0" encoding="utf-8"?>
 <ct:contentTypeSchema xmlns:ct="http://schemas.microsoft.com/office/2006/metadata/contentType" xmlns:ma="http://schemas.microsoft.com/office/2006/metadata/properties/metaAttributes" ct:_="" ma:_="" ma:contentTypeName="Document" ma:contentTypeID="0x010100456CAEA290209545A9F8681F83603874" ma:contentTypeVersion="19" ma:contentTypeDescription="Create a new document." ma:contentTypeScope="" ma:versionID="4bf10bb897fc0ef406baa02b9d664253">
   <xsd:schema xmlns:xsd="http://www.w3.org/2001/XMLSchema" xmlns:xs="http://www.w3.org/2001/XMLSchema" xmlns:p="http://schemas.microsoft.com/office/2006/metadata/properties" xmlns:ns2="8cf100d1-0775-4feb-8634-62999c4541bc" xmlns:ns3="38b325e6-602c-452a-8617-173bf47082c5" targetNamespace="http://schemas.microsoft.com/office/2006/metadata/properties" ma:root="true" ma:fieldsID="1c6be4edf2b996d6a6f54fa7c1dd8d7b" ns2:_="" ns3:_="">
     <xsd:import namespace="8cf100d1-0775-4feb-8634-62999c4541bc"/>
@@ -7401,40 +7476,31 @@
 </ct:contentTypeSchema>
 </file>
 
-<file path=customXml/itemProps1.xml><?xml version="1.0" encoding="utf-8"?>
-<ds:datastoreItem xmlns:ds="http://schemas.openxmlformats.org/officeDocument/2006/customXml" ds:itemID="{3A085C18-819E-4466-9494-DD461C39C2B0}">
-  <ds:schemaRefs>
-    <ds:schemaRef ds:uri="http://schemas.microsoft.com/office/2006/documentManagement/types"/>
-    <ds:schemaRef ds:uri="8cf100d1-0775-4feb-8634-62999c4541bc"/>
-    <ds:schemaRef ds:uri="http://schemas.microsoft.com/office/infopath/2007/PartnerControls"/>
-    <ds:schemaRef ds:uri="38b325e6-602c-452a-8617-173bf47082c5"/>
-    <ds:schemaRef ds:uri="http://schemas.microsoft.com/office/2006/metadata/properties"/>
-    <ds:schemaRef ds:uri="http://schemas.openxmlformats.org/package/2006/metadata/core-properties"/>
-    <ds:schemaRef ds:uri="http://purl.org/dc/elements/1.1/"/>
-    <ds:schemaRef ds:uri="http://www.w3.org/XML/1998/namespace"/>
-    <ds:schemaRef ds:uri="http://purl.org/dc/dcmitype/"/>
-    <ds:schemaRef ds:uri="http://purl.org/dc/terms/"/>
-  </ds:schemaRefs>
-</ds:datastoreItem>
+<file path=customXml/item2.xml><?xml version="1.0" encoding="utf-8"?>
+<p:properties xmlns:p="http://schemas.microsoft.com/office/2006/metadata/properties" xmlns:xsi="http://www.w3.org/2001/XMLSchema-instance" xmlns:pc="http://schemas.microsoft.com/office/infopath/2007/PartnerControls">
+  <documentManagement>
+    <TaxCatchAll xmlns="38b325e6-602c-452a-8617-173bf47082c5" xsi:nil="true"/>
+    <lcf76f155ced4ddcb4097134ff3c332f xmlns="8cf100d1-0775-4feb-8634-62999c4541bc">
+      <Terms xmlns="http://schemas.microsoft.com/office/infopath/2007/PartnerControls"/>
+    </lcf76f155ced4ddcb4097134ff3c332f>
+  </documentManagement>
+</p:properties>
 </file>
 
-<file path=customXml/itemProps2.xml><?xml version="1.0" encoding="utf-8"?>
-<ds:datastoreItem xmlns:ds="http://schemas.openxmlformats.org/officeDocument/2006/customXml" ds:itemID="{2585761D-1AE9-4796-83E7-A2FC381967AF}">
-  <ds:schemaRefs>
-    <ds:schemaRef ds:uri="http://schemas.microsoft.com/sharepoint/v3/contenttype/forms"/>
-  </ds:schemaRefs>
-</ds:datastoreItem>
+<file path=customXml/item3.xml><?xml version="1.0" encoding="utf-8"?>
+<?mso-contentType ?>
+<FormTemplates xmlns="http://schemas.microsoft.com/sharepoint/v3/contenttype/forms">
+  <Display>DocumentLibraryForm</Display>
+  <Edit>DocumentLibraryForm</Edit>
+  <New>DocumentLibraryForm</New>
+</FormTemplates>
 </file>
 
-<file path=customXml/itemProps3.xml><?xml version="1.0" encoding="utf-8"?>
-<ds:datastoreItem xmlns:ds="http://schemas.openxmlformats.org/officeDocument/2006/customXml" ds:itemID="{C438ADBA-56D5-474C-BF2C-97C24DDF66BD}">
-  <ds:schemaRefs>
-    <ds:schemaRef ds:uri="http://schemas.openxmlformats.org/officeDocument/2006/bibliography"/>
-  </ds:schemaRefs>
-</ds:datastoreItem>
+<file path=customXml/item4.xml><?xml version="1.0" encoding="utf-8"?>
+<b:Sources xmlns:b="http://schemas.openxmlformats.org/officeDocument/2006/bibliography" xmlns="http://schemas.openxmlformats.org/officeDocument/2006/bibliography" SelectedStyle="\APASixthEditionOfficeOnline.xsl" StyleName="APA" Version="6"/>
 </file>
 
-<file path=customXml/itemProps4.xml><?xml version="1.0" encoding="utf-8"?>
+<file path=customXml/itemProps1.xml><?xml version="1.0" encoding="utf-8"?>
 <ds:datastoreItem xmlns:ds="http://schemas.openxmlformats.org/officeDocument/2006/customXml" ds:itemID="{D831F62D-68CD-4463-90F0-4EE472F626F4}">
   <ds:schemaRefs>
     <ds:schemaRef ds:uri="http://schemas.microsoft.com/office/2006/metadata/contentType"/>
@@ -7451,4 +7517,31 @@
     <ds:schemaRef ds:uri="http://schemas.microsoft.com/internal/obd"/>
   </ds:schemaRefs>
 </ds:datastoreItem>
+</file>
+
+<file path=customXml/itemProps2.xml><?xml version="1.0" encoding="utf-8"?>
+<ds:datastoreItem xmlns:ds="http://schemas.openxmlformats.org/officeDocument/2006/customXml" ds:itemID="{3A085C18-819E-4466-9494-DD461C39C2B0}">
+  <ds:schemaRefs>
+    <ds:schemaRef ds:uri="http://schemas.microsoft.com/office/2006/metadata/properties"/>
+    <ds:schemaRef ds:uri="http://schemas.microsoft.com/office/infopath/2007/PartnerControls"/>
+    <ds:schemaRef ds:uri="38b325e6-602c-452a-8617-173bf47082c5"/>
+    <ds:schemaRef ds:uri="8cf100d1-0775-4feb-8634-62999c4541bc"/>
+  </ds:schemaRefs>
+</ds:datastoreItem>
+</file>
+
+<file path=customXml/itemProps3.xml><?xml version="1.0" encoding="utf-8"?>
+<ds:datastoreItem xmlns:ds="http://schemas.openxmlformats.org/officeDocument/2006/customXml" ds:itemID="{2585761D-1AE9-4796-83E7-A2FC381967AF}">
+  <ds:schemaRefs>
+    <ds:schemaRef ds:uri="http://schemas.microsoft.com/sharepoint/v3/contenttype/forms"/>
+  </ds:schemaRefs>
+</ds:datastoreItem>
+</file>
+
+<file path=customXml/itemProps4.xml><?xml version="1.0" encoding="utf-8"?>
+<ds:datastoreItem xmlns:ds="http://schemas.openxmlformats.org/officeDocument/2006/customXml" ds:itemID="{C438ADBA-56D5-474C-BF2C-97C24DDF66BD}">
+  <ds:schemaRefs>
+    <ds:schemaRef ds:uri="http://schemas.openxmlformats.org/officeDocument/2006/bibliography"/>
+  </ds:schemaRefs>
+</ds:datastoreItem>
 </file>
</xml_diff>